<commit_message>
Fix MON wrapping to two lines in the calendar header; bump to 0.2.4
MON (and, more marginally, WED) overflowed their weekday-header cell by a
few twips at 10pt Outfit, forcing a wrap. Widen those columns and reclaim
the room from FRI, which had far more slack than it needed.
</commit_message>
<xml_diff>
--- a/assets/template.docx
+++ b/assets/template.docx
@@ -18,13 +18,13 @@
         <w:tblLook w:noHBand="0" w:lastColumn="0" w:firstColumn="1" w:lastRow="0" w:firstRow="1" w:noVBand="1" w:val="04a0"/>
       </w:tblPr>
       <w:tblGrid>
-        <w:gridCol w:w="684"/>
-        <w:gridCol w:w="667"/>
-        <w:gridCol w:w="680"/>
-        <w:gridCol w:w="670"/>
+        <w:gridCol w:w="736"/>
         <w:gridCol w:w="656"/>
-        <w:gridCol w:w="664"/>
-        <w:gridCol w:w="669"/>
+        <w:gridCol w:w="716"/>
+        <w:gridCol w:w="676"/>
+        <w:gridCol w:w="614"/>
+        <w:gridCol w:w="636"/>
+        <w:gridCol w:w="656"/>
         <w:gridCol w:w="1116"/>
         <w:gridCol w:w="1135"/>
         <w:gridCol w:w="2201"/>
@@ -236,7 +236,7 @@
         <w:trPr/>
         <w:tc>
           <w:tcPr>
-            <w:tcW w:w="684" w:type="dxa"/>
+            <w:tcW w:w="736" w:type="dxa"/>
             <w:tcBorders>
               <w:top w:val="single" w:sz="24" w:space="0" w:color="083050"/>
               <w:start w:val="nil"/>
@@ -272,7 +272,7 @@
         </w:tc>
         <w:tc>
           <w:tcPr>
-            <w:tcW w:w="667" w:type="dxa"/>
+            <w:tcW w:w="656" w:type="dxa"/>
             <w:tcBorders>
               <w:top w:val="single" w:sz="24" w:space="0" w:color="083050"/>
               <w:start w:val="nil"/>
@@ -308,7 +308,7 @@
         </w:tc>
         <w:tc>
           <w:tcPr>
-            <w:tcW w:w="680" w:type="dxa"/>
+            <w:tcW w:w="716" w:type="dxa"/>
             <w:tcBorders>
               <w:top w:val="single" w:sz="24" w:space="0" w:color="083050"/>
               <w:start w:val="nil"/>
@@ -344,7 +344,7 @@
         </w:tc>
         <w:tc>
           <w:tcPr>
-            <w:tcW w:w="670" w:type="dxa"/>
+            <w:tcW w:w="676" w:type="dxa"/>
             <w:tcBorders>
               <w:top w:val="single" w:sz="24" w:space="0" w:color="083050"/>
               <w:start w:val="nil"/>
@@ -380,7 +380,7 @@
         </w:tc>
         <w:tc>
           <w:tcPr>
-            <w:tcW w:w="656" w:type="dxa"/>
+            <w:tcW w:w="614" w:type="dxa"/>
             <w:tcBorders>
               <w:top w:val="single" w:sz="24" w:space="0" w:color="083050"/>
               <w:start w:val="nil"/>
@@ -416,7 +416,7 @@
         </w:tc>
         <w:tc>
           <w:tcPr>
-            <w:tcW w:w="664" w:type="dxa"/>
+            <w:tcW w:w="636" w:type="dxa"/>
             <w:tcBorders>
               <w:top w:val="single" w:sz="24" w:space="0" w:color="083050"/>
               <w:start w:val="nil"/>
@@ -454,7 +454,7 @@
         </w:tc>
         <w:tc>
           <w:tcPr>
-            <w:tcW w:w="669" w:type="dxa"/>
+            <w:tcW w:w="656" w:type="dxa"/>
             <w:tcBorders>
               <w:top w:val="single" w:sz="24" w:space="0" w:color="083050"/>
               <w:start w:val="nil"/>
@@ -563,7 +563,7 @@
         <w:trPr/>
         <w:tc>
           <w:tcPr>
-            <w:tcW w:w="684" w:type="dxa"/>
+            <w:tcW w:w="736" w:type="dxa"/>
             <w:tcBorders>
               <w:top w:val="nil"/>
               <w:start w:val="nil"/>
@@ -599,7 +599,7 @@
         </w:tc>
         <w:tc>
           <w:tcPr>
-            <w:tcW w:w="667" w:type="dxa"/>
+            <w:tcW w:w="656" w:type="dxa"/>
             <w:tcBorders>
               <w:top w:val="nil"/>
               <w:start w:val="nil"/>
@@ -635,7 +635,7 @@
         </w:tc>
         <w:tc>
           <w:tcPr>
-            <w:tcW w:w="680" w:type="dxa"/>
+            <w:tcW w:w="716" w:type="dxa"/>
             <w:tcBorders>
               <w:top w:val="nil"/>
               <w:start w:val="nil"/>
@@ -671,7 +671,7 @@
         </w:tc>
         <w:tc>
           <w:tcPr>
-            <w:tcW w:w="670" w:type="dxa"/>
+            <w:tcW w:w="676" w:type="dxa"/>
             <w:tcBorders>
               <w:top w:val="nil"/>
               <w:start w:val="nil"/>
@@ -707,7 +707,7 @@
         </w:tc>
         <w:tc>
           <w:tcPr>
-            <w:tcW w:w="656" w:type="dxa"/>
+            <w:tcW w:w="614" w:type="dxa"/>
             <w:tcBorders>
               <w:top w:val="nil"/>
               <w:start w:val="nil"/>
@@ -743,7 +743,7 @@
         </w:tc>
         <w:tc>
           <w:tcPr>
-            <w:tcW w:w="664" w:type="dxa"/>
+            <w:tcW w:w="636" w:type="dxa"/>
             <w:tcBorders>
               <w:top w:val="nil"/>
               <w:start w:val="nil"/>
@@ -781,7 +781,7 @@
         </w:tc>
         <w:tc>
           <w:tcPr>
-            <w:tcW w:w="669" w:type="dxa"/>
+            <w:tcW w:w="656" w:type="dxa"/>
             <w:tcBorders>
               <w:top w:val="nil"/>
               <w:start w:val="nil"/>
@@ -6552,13 +6552,13 @@
         <w:tblLook w:noHBand="0" w:lastColumn="0" w:firstColumn="1" w:lastRow="0" w:firstRow="1" w:noVBand="1" w:val="04a0"/>
       </w:tblPr>
       <w:tblGrid>
-        <w:gridCol w:w="684"/>
-        <w:gridCol w:w="667"/>
-        <w:gridCol w:w="680"/>
-        <w:gridCol w:w="670"/>
+        <w:gridCol w:w="736"/>
         <w:gridCol w:w="656"/>
-        <w:gridCol w:w="664"/>
-        <w:gridCol w:w="669"/>
+        <w:gridCol w:w="716"/>
+        <w:gridCol w:w="676"/>
+        <w:gridCol w:w="614"/>
+        <w:gridCol w:w="636"/>
+        <w:gridCol w:w="656"/>
         <w:gridCol w:w="1116"/>
         <w:gridCol w:w="1135"/>
         <w:gridCol w:w="2201"/>
@@ -6770,7 +6770,7 @@
         <w:trPr/>
         <w:tc>
           <w:tcPr>
-            <w:tcW w:w="684" w:type="dxa"/>
+            <w:tcW w:w="736" w:type="dxa"/>
             <w:tcBorders>
               <w:top w:val="single" w:sz="24" w:space="0" w:color="083050"/>
               <w:start w:val="nil"/>
@@ -6806,7 +6806,7 @@
         </w:tc>
         <w:tc>
           <w:tcPr>
-            <w:tcW w:w="667" w:type="dxa"/>
+            <w:tcW w:w="656" w:type="dxa"/>
             <w:tcBorders>
               <w:top w:val="single" w:sz="24" w:space="0" w:color="083050"/>
               <w:start w:val="nil"/>
@@ -6842,7 +6842,7 @@
         </w:tc>
         <w:tc>
           <w:tcPr>
-            <w:tcW w:w="680" w:type="dxa"/>
+            <w:tcW w:w="716" w:type="dxa"/>
             <w:tcBorders>
               <w:top w:val="single" w:sz="24" w:space="0" w:color="083050"/>
               <w:start w:val="nil"/>
@@ -6878,7 +6878,7 @@
         </w:tc>
         <w:tc>
           <w:tcPr>
-            <w:tcW w:w="670" w:type="dxa"/>
+            <w:tcW w:w="676" w:type="dxa"/>
             <w:tcBorders>
               <w:top w:val="single" w:sz="24" w:space="0" w:color="083050"/>
               <w:start w:val="nil"/>
@@ -6914,7 +6914,7 @@
         </w:tc>
         <w:tc>
           <w:tcPr>
-            <w:tcW w:w="656" w:type="dxa"/>
+            <w:tcW w:w="614" w:type="dxa"/>
             <w:tcBorders>
               <w:top w:val="single" w:sz="24" w:space="0" w:color="083050"/>
               <w:start w:val="nil"/>
@@ -6950,7 +6950,7 @@
         </w:tc>
         <w:tc>
           <w:tcPr>
-            <w:tcW w:w="664" w:type="dxa"/>
+            <w:tcW w:w="636" w:type="dxa"/>
             <w:tcBorders>
               <w:top w:val="single" w:sz="24" w:space="0" w:color="083050"/>
               <w:start w:val="nil"/>
@@ -6988,7 +6988,7 @@
         </w:tc>
         <w:tc>
           <w:tcPr>
-            <w:tcW w:w="669" w:type="dxa"/>
+            <w:tcW w:w="656" w:type="dxa"/>
             <w:tcBorders>
               <w:top w:val="single" w:sz="24" w:space="0" w:color="083050"/>
               <w:start w:val="nil"/>
@@ -7097,7 +7097,7 @@
         <w:trPr/>
         <w:tc>
           <w:tcPr>
-            <w:tcW w:w="684" w:type="dxa"/>
+            <w:tcW w:w="736" w:type="dxa"/>
             <w:tcBorders>
               <w:top w:val="nil"/>
               <w:start w:val="nil"/>
@@ -7133,7 +7133,7 @@
         </w:tc>
         <w:tc>
           <w:tcPr>
-            <w:tcW w:w="667" w:type="dxa"/>
+            <w:tcW w:w="656" w:type="dxa"/>
             <w:tcBorders>
               <w:top w:val="nil"/>
               <w:start w:val="nil"/>
@@ -7169,7 +7169,7 @@
         </w:tc>
         <w:tc>
           <w:tcPr>
-            <w:tcW w:w="680" w:type="dxa"/>
+            <w:tcW w:w="716" w:type="dxa"/>
             <w:tcBorders>
               <w:top w:val="nil"/>
               <w:start w:val="nil"/>
@@ -7205,7 +7205,7 @@
         </w:tc>
         <w:tc>
           <w:tcPr>
-            <w:tcW w:w="670" w:type="dxa"/>
+            <w:tcW w:w="676" w:type="dxa"/>
             <w:tcBorders>
               <w:top w:val="nil"/>
               <w:start w:val="nil"/>
@@ -7241,7 +7241,7 @@
         </w:tc>
         <w:tc>
           <w:tcPr>
-            <w:tcW w:w="656" w:type="dxa"/>
+            <w:tcW w:w="614" w:type="dxa"/>
             <w:tcBorders>
               <w:top w:val="nil"/>
               <w:start w:val="nil"/>
@@ -7277,7 +7277,7 @@
         </w:tc>
         <w:tc>
           <w:tcPr>
-            <w:tcW w:w="664" w:type="dxa"/>
+            <w:tcW w:w="636" w:type="dxa"/>
             <w:tcBorders>
               <w:top w:val="nil"/>
               <w:start w:val="nil"/>
@@ -7315,7 +7315,7 @@
         </w:tc>
         <w:tc>
           <w:tcPr>
-            <w:tcW w:w="669" w:type="dxa"/>
+            <w:tcW w:w="656" w:type="dxa"/>
             <w:tcBorders>
               <w:top w:val="nil"/>
               <w:start w:val="nil"/>
@@ -7458,13 +7458,13 @@
         <w:tblLook w:noHBand="0" w:lastColumn="0" w:firstColumn="1" w:lastRow="0" w:firstRow="1" w:noVBand="1" w:val="04a0"/>
       </w:tblPr>
       <w:tblGrid>
-        <w:gridCol w:w="685"/>
-        <w:gridCol w:w="663"/>
-        <w:gridCol w:w="678"/>
-        <w:gridCol w:w="669"/>
-        <w:gridCol w:w="650"/>
-        <w:gridCol w:w="660"/>
-        <w:gridCol w:w="667"/>
+        <w:gridCol w:w="733"/>
+        <w:gridCol w:w="653"/>
+        <w:gridCol w:w="713"/>
+        <w:gridCol w:w="673"/>
+        <w:gridCol w:w="613"/>
+        <w:gridCol w:w="634"/>
+        <w:gridCol w:w="653"/>
         <w:gridCol w:w="1079"/>
         <w:gridCol w:w="1115"/>
         <w:gridCol w:w="2166"/>
@@ -9265,7 +9265,7 @@
         <w:trPr/>
         <w:tc>
           <w:tcPr>
-            <w:tcW w:w="685" w:type="dxa"/>
+            <w:tcW w:w="733" w:type="dxa"/>
             <w:tcBorders>
               <w:top w:val="single" w:sz="24" w:space="0" w:color="083050"/>
               <w:start w:val="nil"/>
@@ -9301,7 +9301,7 @@
         </w:tc>
         <w:tc>
           <w:tcPr>
-            <w:tcW w:w="663" w:type="dxa"/>
+            <w:tcW w:w="653" w:type="dxa"/>
             <w:tcBorders>
               <w:top w:val="single" w:sz="24" w:space="0" w:color="083050"/>
               <w:start w:val="nil"/>
@@ -9337,7 +9337,7 @@
         </w:tc>
         <w:tc>
           <w:tcPr>
-            <w:tcW w:w="678" w:type="dxa"/>
+            <w:tcW w:w="713" w:type="dxa"/>
             <w:tcBorders>
               <w:top w:val="single" w:sz="24" w:space="0" w:color="083050"/>
               <w:start w:val="nil"/>
@@ -9373,7 +9373,7 @@
         </w:tc>
         <w:tc>
           <w:tcPr>
-            <w:tcW w:w="669" w:type="dxa"/>
+            <w:tcW w:w="673" w:type="dxa"/>
             <w:tcBorders>
               <w:top w:val="single" w:sz="24" w:space="0" w:color="083050"/>
               <w:start w:val="nil"/>
@@ -9409,7 +9409,7 @@
         </w:tc>
         <w:tc>
           <w:tcPr>
-            <w:tcW w:w="650" w:type="dxa"/>
+            <w:tcW w:w="613" w:type="dxa"/>
             <w:tcBorders>
               <w:top w:val="single" w:sz="24" w:space="0" w:color="083050"/>
               <w:start w:val="nil"/>
@@ -9445,7 +9445,7 @@
         </w:tc>
         <w:tc>
           <w:tcPr>
-            <w:tcW w:w="660" w:type="dxa"/>
+            <w:tcW w:w="634" w:type="dxa"/>
             <w:tcBorders>
               <w:top w:val="single" w:sz="24" w:space="0" w:color="083050"/>
               <w:start w:val="nil"/>
@@ -9483,7 +9483,7 @@
         </w:tc>
         <w:tc>
           <w:tcPr>
-            <w:tcW w:w="667" w:type="dxa"/>
+            <w:tcW w:w="653" w:type="dxa"/>
             <w:tcBorders>
               <w:top w:val="single" w:sz="24" w:space="0" w:color="083050"/>
               <w:start w:val="nil"/>
@@ -9592,7 +9592,7 @@
         <w:trPr/>
         <w:tc>
           <w:tcPr>
-            <w:tcW w:w="685" w:type="dxa"/>
+            <w:tcW w:w="733" w:type="dxa"/>
             <w:tcBorders>
               <w:top w:val="single" w:sz="8" w:space="0" w:color="E6E6E6"/>
               <w:start w:val="nil"/>
@@ -9628,7 +9628,7 @@
         </w:tc>
         <w:tc>
           <w:tcPr>
-            <w:tcW w:w="663" w:type="dxa"/>
+            <w:tcW w:w="653" w:type="dxa"/>
             <w:tcBorders>
               <w:top w:val="single" w:sz="8" w:space="0" w:color="E6E6E6"/>
               <w:start w:val="nil"/>
@@ -9664,7 +9664,7 @@
         </w:tc>
         <w:tc>
           <w:tcPr>
-            <w:tcW w:w="678" w:type="dxa"/>
+            <w:tcW w:w="713" w:type="dxa"/>
             <w:tcBorders>
               <w:top w:val="single" w:sz="8" w:space="0" w:color="E6E6E6"/>
               <w:start w:val="nil"/>
@@ -9700,7 +9700,7 @@
         </w:tc>
         <w:tc>
           <w:tcPr>
-            <w:tcW w:w="669" w:type="dxa"/>
+            <w:tcW w:w="673" w:type="dxa"/>
             <w:tcBorders>
               <w:top w:val="single" w:sz="8" w:space="0" w:color="E6E6E6"/>
               <w:start w:val="nil"/>
@@ -9736,7 +9736,7 @@
         </w:tc>
         <w:tc>
           <w:tcPr>
-            <w:tcW w:w="650" w:type="dxa"/>
+            <w:tcW w:w="613" w:type="dxa"/>
             <w:tcBorders>
               <w:top w:val="single" w:sz="8" w:space="0" w:color="E6E6E6"/>
               <w:start w:val="nil"/>
@@ -9772,7 +9772,7 @@
         </w:tc>
         <w:tc>
           <w:tcPr>
-            <w:tcW w:w="660" w:type="dxa"/>
+            <w:tcW w:w="634" w:type="dxa"/>
             <w:tcBorders>
               <w:top w:val="single" w:sz="8" w:space="0" w:color="E6E6E6"/>
               <w:start w:val="nil"/>
@@ -9810,7 +9810,7 @@
         </w:tc>
         <w:tc>
           <w:tcPr>
-            <w:tcW w:w="667" w:type="dxa"/>
+            <w:tcW w:w="653" w:type="dxa"/>
             <w:tcBorders>
               <w:top w:val="single" w:sz="8" w:space="0" w:color="E6E6E6"/>
               <w:start w:val="nil"/>

</xml_diff>